<commit_message>
Sync portfolio from CP Product Advisory
</commit_message>
<xml_diff>
--- a/docs/resume/clinton-pracher-platform-data-ai-resume.docx
+++ b/docs/resume/clinton-pracher-platform-data-ai-resume.docx
@@ -339,8 +339,115 @@
                 <w:sz w:val="18"/>
                 <w:szCs w:val="18"/>
               </w:rPr>
-              <w:t>Las Vegas, NV | clintonpracher@gmail.com | linkedin.com/in/clinton-pracher | clintonpracher.com</w:t>
+              <w:t>Las Vegas, NV 89141</w:t>
             </w:r>
+            <w:r>
+              <w:rPr>
+                <w:rStyle w:val="divPARAGRAPHCNTCdiv"/>
+                <w:rFonts w:ascii="Century Gothic" w:eastAsia="Century Gothic" w:hAnsi="Century Gothic" w:cs="Century Gothic"/>
+                <w:color w:val="FFFFFF"/>
+                <w:sz w:val="18"/>
+                <w:szCs w:val="18"/>
+                <w:shd w:val="clear" w:color="auto" w:fill="auto"/>
+              </w:rPr>
+              <w:t xml:space="preserve"> </w:t>
+            </w:r>
+            <w:r>
+              <w:rPr>
+                <w:rStyle w:val="sprtr"/>
+                <w:rFonts w:ascii="Century Gothic" w:eastAsia="Century Gothic" w:hAnsi="Century Gothic" w:cs="Century Gothic"/>
+                <w:color w:val="FFFFFF"/>
+                <w:sz w:val="18"/>
+                <w:szCs w:val="18"/>
+              </w:rPr>
+              <w:t> | </w:t>
+            </w:r>
+            <w:r>
+              <w:rPr>
+                <w:rStyle w:val="divPARAGRAPHCNTCdiv"/>
+                <w:rFonts w:ascii="Century Gothic" w:eastAsia="Century Gothic" w:hAnsi="Century Gothic" w:cs="Century Gothic"/>
+                <w:color w:val="FFFFFF"/>
+                <w:sz w:val="18"/>
+                <w:szCs w:val="18"/>
+                <w:shd w:val="clear" w:color="auto" w:fill="auto"/>
+              </w:rPr>
+              <w:t xml:space="preserve"> </w:t>
+            </w:r>
+            <w:r>
+              <w:rPr>
+                <w:rStyle w:val="span"/>
+                <w:rFonts w:ascii="Century Gothic" w:eastAsia="Century Gothic" w:hAnsi="Century Gothic" w:cs="Century Gothic"/>
+                <w:color w:val="FFFFFF"/>
+                <w:sz w:val="18"/>
+                <w:szCs w:val="18"/>
+              </w:rPr>
+              <w:t>702-772-0242</w:t>
+            </w:r>
+            <w:r>
+              <w:rPr>
+                <w:rStyle w:val="sprtr"/>
+                <w:rFonts w:ascii="Century Gothic" w:eastAsia="Century Gothic" w:hAnsi="Century Gothic" w:cs="Century Gothic"/>
+                <w:color w:val="FFFFFF"/>
+                <w:sz w:val="18"/>
+                <w:szCs w:val="18"/>
+              </w:rPr>
+              <w:t>  | </w:t>
+            </w:r>
+            <w:r>
+              <w:rPr>
+                <w:rStyle w:val="divPARAGRAPHCNTCdiv"/>
+                <w:rFonts w:ascii="Century Gothic" w:eastAsia="Century Gothic" w:hAnsi="Century Gothic" w:cs="Century Gothic"/>
+                <w:color w:val="FFFFFF"/>
+                <w:sz w:val="18"/>
+                <w:szCs w:val="18"/>
+                <w:shd w:val="clear" w:color="auto" w:fill="auto"/>
+              </w:rPr>
+              <w:t xml:space="preserve"> </w:t>
+            </w:r>
+            <w:r>
+              <w:rPr>
+                <w:rStyle w:val="span"/>
+                <w:rFonts w:ascii="Century Gothic" w:eastAsia="Century Gothic" w:hAnsi="Century Gothic" w:cs="Century Gothic"/>
+                <w:color w:val="FFFFFF"/>
+                <w:sz w:val="18"/>
+                <w:szCs w:val="18"/>
+              </w:rPr>
+              <w:t>clintonpracher@gmail.com</w:t>
+            </w:r>
+            <w:r>
+              <w:rPr>
+                <w:rStyle w:val="divPARAGRAPHCNTCdiv"/>
+                <w:rFonts w:ascii="Century Gothic" w:eastAsia="Century Gothic" w:hAnsi="Century Gothic" w:cs="Century Gothic"/>
+                <w:color w:val="FFFFFF"/>
+                <w:sz w:val="18"/>
+                <w:szCs w:val="18"/>
+                <w:shd w:val="clear" w:color="auto" w:fill="auto"/>
+              </w:rPr>
+              <w:t xml:space="preserve"> |</w:t>
+            </w:r>
+            <w:r>
+              <w:rPr>
+                <w:rStyle w:val="divPARAGRAPHCNTCdiv"/>
+                <w:rFonts w:ascii="Century Gothic" w:eastAsia="Century Gothic" w:hAnsi="Century Gothic" w:cs="Century Gothic"/>
+                <w:color w:val="FFFFFF" w:themeColor="background1"/>
+                <w:sz w:val="18"/>
+                <w:szCs w:val="18"/>
+                <w:shd w:val="clear" w:color="auto" w:fill="auto"/>
+              </w:rPr>
+              <w:t xml:space="preserve"> </w:t>
+            </w:r>
+            <w:hyperlink r:id="rId8" w:history="1">
+              <w:r>
+                <w:rPr>
+                  <w:rStyle w:val="Hyperlink"/>
+                  <w:rFonts w:ascii="Century Gothic" w:eastAsia="Century Gothic" w:hAnsi="Century Gothic" w:cs="Century Gothic"/>
+                  <w:color w:val="FFFFFF" w:themeColor="background1"/>
+                  <w:sz w:val="18"/>
+                  <w:szCs w:val="18"/>
+                </w:rPr>
+                <w:t>linkedin.com/in/clinton-pracher</w:t>
+              </w:r>
+            </w:hyperlink>
           </w:p>
           <w:p>
             <w:pPr>
@@ -3189,49 +3296,6 @@
         <w:spacing w:line="280" w:lineRule="atLeast"/>
         <w:ind w:left="380" w:hanging="283"/>
         <w:rPr>
-          <w:rStyle w:val="Strong1"/>
-          <w:rFonts w:ascii="Century Gothic" w:eastAsia="Century Gothic" w:hAnsi="Century Gothic" w:cs="Century Gothic"/>
-          <w:color w:val="231F20"/>
-          <w:sz w:val="18"/>
-          <w:szCs w:val="18"/>
-        </w:rPr>
-      </w:pPr>
-      <w:r>
-        <w:rPr>
-          <w:rStyle w:val="Strong1"/>
-          <w:rFonts w:ascii="Century Gothic" w:eastAsia="Century Gothic" w:hAnsi="Century Gothic" w:cs="Century Gothic"/>
-          <w:b/>
-          <w:bCs/>
-          <w:color w:val="231F20"/>
-          <w:sz w:val="18"/>
-          <w:szCs w:val="18"/>
-        </w:rPr>
-        <w:t>Enterprise Platforms &amp; MarTech:</w:t>
-      </w:r>
-      <w:r>
-        <w:rPr>
-          <w:rStyle w:val="Strong1"/>
-          <w:rFonts w:ascii="Century Gothic" w:eastAsia="Century Gothic" w:hAnsi="Century Gothic" w:cs="Century Gothic"/>
-          <w:color w:val="231F20"/>
-          <w:sz w:val="18"/>
-          <w:szCs w:val="18"/>
-        </w:rPr>
-        <w:t xml:space="preserve"> Salesforce, Snowflake, CDP, Identity Resolution, DV360, SA360, Contentful, PIM/DAM, NetSuite</w:t>
-      </w:r>
-    </w:p>
-    <w:p>
-      <w:pPr>
-        <w:pStyle w:val="divdocumentulli"/>
-        <w:numPr>
-          <w:ilvl w:val="0"/>
-          <w:numId w:val="11"/>
-        </w:numPr>
-        <w:pBdr>
-          <w:left w:val="none" w:sz="0" w:space="0" w:color="auto"/>
-        </w:pBdr>
-        <w:spacing w:line="280" w:lineRule="atLeast"/>
-        <w:ind w:left="380" w:hanging="283"/>
-        <w:rPr>
           <w:rFonts w:ascii="Century Gothic" w:eastAsia="Century Gothic" w:hAnsi="Century Gothic" w:cs="Century Gothic"/>
           <w:color w:val="231F20"/>
           <w:sz w:val="18"/>
@@ -3810,12 +3874,15 @@
           <w:szCs w:val="18"/>
         </w:rPr>
       </w:pPr>
-      <w:hyperlink r:id="rId17">
+      <w:hyperlink r:id="rId12" w:history="1">
         <w:r>
           <w:rPr>
             <w:rStyle w:val="Hyperlink"/>
+            <w:rFonts w:ascii="Century Gothic" w:hAnsi="Century Gothic"/>
+            <w:sz w:val="18"/>
+            <w:szCs w:val="18"/>
           </w:rPr>
-          <w:t>clintonpracher.com</w:t>
+          <w:t>www.cpproductadvisory.com</w:t>
         </w:r>
       </w:hyperlink>
     </w:p>

</xml_diff>

<commit_message>
Sync portfolio: Platform AI resume Word PDF + live-stats web copy
</commit_message>
<xml_diff>
--- a/docs/resume/clinton-pracher-platform-data-ai-resume.docx
+++ b/docs/resume/clinton-pracher-platform-data-ai-resume.docx
@@ -312,7 +312,7 @@
                 <w:rFonts w:ascii="Century Gothic" w:eastAsia="Century Gothic" w:hAnsi="Century Gothic" w:cs="Century Gothic"/>
                 <w:color w:val="FFFFFF"/>
               </w:rPr>
-              <w:t>PRODUCT &amp; PLATFORM EXECUTIVE | DATA &amp; AI | ENTERPRISE TRANSFORMATION</w:t>
+              <w:t>DIRECTOR · ARTIFICIAL INTELLIGENCE PLATFORM · AGENTIC SYSTEMS · ENTERPRISE READINESS</w:t>
             </w:r>
           </w:p>
           <w:p>
@@ -563,7 +563,7 @@
           <w:sz w:val="18"/>
           <w:szCs w:val="18"/>
         </w:rPr>
-        <w:t>Product and platform executive with 12+ years leading complex portfolios across enterprise platforms, data products, AI capabilities, and digital experiences. Owned a portfolio of 13 AI and data products across 100+ global markets, leading 60+ engineers, analysts, and program leads and managing $8M in product investment tied to systems governing $600M in annual spend.</w:t>
+        <w:t>Director-level platform and artificial intelligence product leader with 12+ years owning complex portfolios across artificial intelligence platforms, data products, and enterprise environments. Owned 13 artificial intelligence and data products across 100+ global markets, leading 60+ engineers, analysts, and program leads with an $8M investment envelope tied to systems governing $600M in annual spend.</w:t>
       </w:r>
     </w:p>
     <w:p>
@@ -581,7 +581,7 @@
           <w:sz w:val="18"/>
           <w:szCs w:val="18"/>
         </w:rPr>
-        <w:t>Builds product organizations as well as products. Four team members coached from business analyst level are now Senior Product Managers at strong companies. At V Shred, built a team of five product managers from the ground up after promotion to Head of Product Management within one year.</w:t>
+        <w:t>Builds agentic operating systems and machine learning / artificial intelligence platform capabilities that enterprises can trust: ownership models, evaluation and trust thresholds, and human approval gates on production artificial intelligence workflows. In practice today: an Operator Control Plane with 65 skills and 28 governed automations running as a live control plane, not a slide deck.</w:t>
       </w:r>
     </w:p>
     <w:p>
@@ -599,7 +599,7 @@
           <w:sz w:val="18"/>
           <w:szCs w:val="18"/>
         </w:rPr>
-        <w:t>Builds the systems underneath the product: portfolio strategy, KPI frameworks, decision infrastructure, operating models, and governance that connect customer needs and technical investment to measurable outcomes. Results include $60M+ in incremental revenue, 40% faster investment decisions, subscription churn reduced from 75% to under 30%, and global platform scale.</w:t>
+        <w:t>Ships enterprise readiness into the product lifecycle: compliance, privacy, artificial intelligence ethics, decision rights, and security-review partnership so platform adoption does not wait on one-off exceptions. Results include 40% faster investment decisions, $60M+ incremental revenue impact, and global platform scale.</w:t>
       </w:r>
     </w:p>
     <w:p>
@@ -617,7 +617,7 @@
           <w:sz w:val="18"/>
           <w:szCs w:val="18"/>
         </w:rPr>
-        <w:t>Most effective in FIX-SCALE environments where platform complexity, fragmented data, unclear decision rights, or AI adoption has outgrown the operating model. Diagnoses the constraint, rebuilds the system, and leaves teams with infrastructure they can run without constant reinvention.</w:t>
+        <w:t>Most effective when artificial intelligence adoption, platform complexity, or unclear ownership has outgrown the operating model. Diagnoses the constraint, rebuilds the control plane, and leaves teams with infrastructure they can run without constant reinvention.</w:t>
       </w:r>
     </w:p>
     <w:tbl>
@@ -744,7 +744,7 @@
                 <w:sz w:val="18"/>
                 <w:szCs w:val="18"/>
               </w:rPr>
-              <w:t>Enterprise Platform &amp; Portfolio Strategy</w:t>
+              <w:t>Agentic Architecture and Artificial Intelligence Control Planes</w:t>
             </w:r>
           </w:p>
           <w:p>
@@ -772,7 +772,7 @@
                 <w:sz w:val="18"/>
                 <w:szCs w:val="18"/>
               </w:rPr>
-              <w:t>Data Products &amp; Decision Infrastructure</w:t>
+              <w:t>Machine Learning and Artificial Intelligence Platform Product</w:t>
             </w:r>
           </w:p>
           <w:p>
@@ -800,7 +800,7 @@
                 <w:sz w:val="18"/>
                 <w:szCs w:val="18"/>
               </w:rPr>
-              <w:t>AI Product Strategy &amp; Governance</w:t>
+              <w:t>Enterprise Readiness and Compliance-Ready Capabilities</w:t>
             </w:r>
           </w:p>
           <w:p>
@@ -828,7 +828,7 @@
                 <w:sz w:val="18"/>
                 <w:szCs w:val="18"/>
               </w:rPr>
-              <w:t>Platform Modernization &amp; Integration</w:t>
+              <w:t>Data Platforms and Decision Infrastructure</w:t>
             </w:r>
           </w:p>
         </w:tc>
@@ -865,7 +865,7 @@
                 <w:sz w:val="18"/>
                 <w:szCs w:val="18"/>
               </w:rPr>
-              <w:t>KPI Frameworks &amp; Operating Models</w:t>
+              <w:t>Platform Governance, Audit Trails, and Evaluation Thresholds</w:t>
             </w:r>
           </w:p>
           <w:p>
@@ -890,7 +890,7 @@
                 <w:sz w:val="18"/>
                 <w:szCs w:val="18"/>
               </w:rPr>
-              <w:t>Product Organization &amp; PM Development</w:t>
+              <w:t>Cross-Functional Control Plane Design</w:t>
             </w:r>
           </w:p>
           <w:p>
@@ -915,7 +915,7 @@
                 <w:sz w:val="18"/>
                 <w:szCs w:val="18"/>
               </w:rPr>
-              <w:t>Executive &amp; Cross-Functional Alignment</w:t>
+              <w:t>Product Organization and Product Manager Development</w:t>
             </w:r>
           </w:p>
           <w:p>
@@ -940,7 +940,7 @@
                 <w:sz w:val="18"/>
                 <w:szCs w:val="18"/>
               </w:rPr>
-              <w:t>Budget Ownership &amp; Investment Prioritization</w:t>
+              <w:t>Budget Ownership and Investment Prioritization</w:t>
             </w:r>
           </w:p>
         </w:tc>
@@ -1119,7 +1119,7 @@
           <w:sz w:val="18"/>
           <w:szCs w:val="18"/>
         </w:rPr>
-        <w:t>Founded an independent product and AI advisory practice focused on the decision systems, operating models, and product infrastructure required to scale complex organizations</w:t>
+        <w:t>Founded an independent product and artificial intelligence advisory practice focused on decision systems, operating models, agentic architecture, and enterprise-ready platform infrastructure for complex organizations</w:t>
       </w:r>
     </w:p>
     <w:p>
@@ -1175,7 +1175,7 @@
           <w:sz w:val="18"/>
           <w:szCs w:val="18"/>
         </w:rPr>
-        <w:t>Built and operate an AI-enabled Operator Control Plane with 65 specialized skills and 28 governed automations, using explicit task ownership and decision controls to run the practice at solo-operator scale</w:t>
+        <w:t>Built and operate an agentic Operator Control Plane with 65 specialized skills and 28 governed automations, using Claude and Cursor with explicit task ownership, audit trails, and human approval gates on production artificial intelligence workflows</w:t>
       </w:r>
     </w:p>
     <w:p>
@@ -1323,7 +1323,7 @@
           <w:sz w:val="18"/>
           <w:szCs w:val="18"/>
         </w:rPr>
-        <w:t>Promoted from Senior Product Manager at Merkle to Director at Dentsu based on performance, taking ownership of 13 AI and data products, an $8M budget, and a distributed team of 60+ engineers, analysts, and program leads across 100+ global markets</w:t>
+        <w:t>Promoted from Senior Product Manager at Merkle to Director at Dentsu based on performance, taking ownership of 13 artificial intelligence and data products, an $8M budget, and a distributed team of 60+ engineers, analysts, and program leads across 100+ global markets</w:t>
       </w:r>
     </w:p>
     <w:p>
@@ -1351,7 +1351,7 @@
           <w:sz w:val="18"/>
           <w:szCs w:val="18"/>
         </w:rPr>
-        <w:t>Owned portfolio strategy and execution across customer data, identity, audience activation, content intelligence, production automation, and measurement platforms serving enterprise teams across every major digital channel</w:t>
+        <w:t>Owned portfolio strategy for artificial intelligence and data platforms spanning customer data, identity, audience activation, content intelligence, production automation, and measurement, with enterprise readiness requirements embedded in delivery</w:t>
       </w:r>
     </w:p>
     <w:p>
@@ -1379,7 +1379,7 @@
           <w:sz w:val="18"/>
           <w:szCs w:val="18"/>
         </w:rPr>
-        <w:t>Built KPI frameworks and centralized decision systems connecting platform capabilities to revenue, campaign performance, and operating efficiency, giving leaders a shared basis for investment prioritization across the portfolio</w:t>
+        <w:t>Built key performance indicator frameworks and centralized decision systems connecting platform capabilities to revenue, campaign performance, and operating efficiency, giving leaders a shared basis for investment prioritization across the portfolio</w:t>
       </w:r>
     </w:p>
     <w:p>
@@ -1435,7 +1435,7 @@
           <w:sz w:val="18"/>
           <w:szCs w:val="18"/>
         </w:rPr>
-        <w:t>Aligned technical and business leaders around a unified platform roadmap, enabling parallel progress across innovation, compliance, and growth while meeting GDPR, CCPA, and AI ethics requirements across 100+ markets</w:t>
+        <w:t>Embedded General Data Protection Regulation, California Consumer Privacy Act, and artificial intelligence ethics requirements into the product development lifecycle so compliance became a scalable platform capability rather than a deal-by-deal exception process</w:t>
       </w:r>
     </w:p>
     <w:p>
@@ -2900,17 +2900,17 @@
           <w:sz w:val="18"/>
           <w:szCs w:val="18"/>
         </w:rPr>
-        <w:t>AI Powered Marketing Suite (Dentsu, 2024-2025)</w:t>
-      </w:r>
-      <w:r>
-        <w:rPr>
-          <w:rStyle w:val="Strong1"/>
-          <w:rFonts w:ascii="Century Gothic" w:eastAsia="Century Gothic" w:hAnsi="Century Gothic" w:cs="Century Gothic"/>
-          <w:color w:val="231F20"/>
-          <w:sz w:val="18"/>
-          <w:szCs w:val="18"/>
-        </w:rPr>
-        <w:t>: Directed the strategy and portfolio management for 13 AI products spanning creative intelligence, audience targeting, content production, and measurement across 100+ global markets, enabling privacy-safe consumer connections at enterprise scale</w:t>
+        <w:t>Operator Control Plane (CP Product Advisory, 2025-2026):</w:t>
+      </w:r>
+      <w:r>
+        <w:rPr>
+          <w:rStyle w:val="Strong1"/>
+          <w:rFonts w:ascii="Century Gothic" w:eastAsia="Century Gothic" w:hAnsi="Century Gothic" w:cs="Century Gothic"/>
+          <w:color w:val="231F20"/>
+          <w:sz w:val="18"/>
+          <w:szCs w:val="18"/>
+        </w:rPr>
+        <w:t xml:space="preserve"> Built and operate an agentic Operator Control Plane with 65 specialized skills and 28 governed automations, using Claude and Cursor with explicit task ownership, audit trails, and human approval gates on production artificial intelligence workflows.</w:t>
       </w:r>
     </w:p>
     <w:p>
@@ -2943,17 +2943,17 @@
           <w:sz w:val="18"/>
           <w:szCs w:val="18"/>
         </w:rPr>
-        <w:t>Media360 Unified Reporting Platform (Merkle, 2023)</w:t>
-      </w:r>
-      <w:r>
-        <w:rPr>
-          <w:rStyle w:val="Strong1"/>
-          <w:rFonts w:ascii="Century Gothic" w:eastAsia="Century Gothic" w:hAnsi="Century Gothic" w:cs="Century Gothic"/>
-          <w:color w:val="231F20"/>
-          <w:sz w:val="18"/>
-          <w:szCs w:val="18"/>
-        </w:rPr>
-        <w:t>: Built the centralized reporting system that consolidated 95% of a $600M marketing budget across 140 markets for a global streaming client, unifying marketing spend tracking, asset performance, and full-funnel reporting across every major digital channel including CTV, DSP, DV360, and SA360</w:t>
+        <w:t>AI Powered Marketing Suite (Dentsu, 2024-2025):</w:t>
+      </w:r>
+      <w:r>
+        <w:rPr>
+          <w:rStyle w:val="Strong1"/>
+          <w:rFonts w:ascii="Century Gothic" w:eastAsia="Century Gothic" w:hAnsi="Century Gothic" w:cs="Century Gothic"/>
+          <w:color w:val="231F20"/>
+          <w:sz w:val="18"/>
+          <w:szCs w:val="18"/>
+        </w:rPr>
+        <w:t xml:space="preserve"> Directed the strategy and portfolio management for 13 AI products spanning creative intelligence, audience targeting, content production, and measurement across 100+ global markets, enabling privacy-safe consumer connections at enterprise scale</w:t>
       </w:r>
     </w:p>
     <w:p>
@@ -2986,25 +2986,17 @@
           <w:sz w:val="18"/>
           <w:szCs w:val="18"/>
         </w:rPr>
-        <w:t>V SHRED Mobile App (V SHRED, 2018)</w:t>
-      </w:r>
-      <w:r>
-        <w:rPr>
-          <w:rStyle w:val="Strong1"/>
-          <w:rFonts w:ascii="Century Gothic" w:eastAsia="Century Gothic" w:hAnsi="Century Gothic" w:cs="Century Gothic"/>
-          <w:color w:val="231F20"/>
-          <w:sz w:val="18"/>
-          <w:szCs w:val="18"/>
-        </w:rPr>
-        <w:t xml:space="preserve">: </w:t>
-      </w:r>
-      <w:r>
-        <w:rPr>
-          <w:rFonts w:ascii="Century Gothic" w:hAnsi="Century Gothic"/>
-          <w:sz w:val="18"/>
-          <w:szCs w:val="18"/>
-        </w:rPr>
-        <w:t>As Head of Product Management overseeing a 24-product digital portfolio, led end-to-end product development for a consumer fitness app that hit 100K downloads in its first 24 hours, with sustained engagement and retention improvements post-launch.</w:t>
+        <w:t>Media360 Unified Reporting Platform (Merkle, 2023):</w:t>
+      </w:r>
+      <w:r>
+        <w:rPr>
+          <w:rStyle w:val="Strong1"/>
+          <w:rFonts w:ascii="Century Gothic" w:eastAsia="Century Gothic" w:hAnsi="Century Gothic" w:cs="Century Gothic"/>
+          <w:color w:val="231F20"/>
+          <w:sz w:val="18"/>
+          <w:szCs w:val="18"/>
+        </w:rPr>
+        <w:t xml:space="preserve"> Built the centralized reporting system that consolidated 95% of a $600M marketing budget across 140 markets for a global streaming client, unifying marketing spend tracking, asset performance, and full-funnel reporting across every major digital channel including CTV, DSP, DV360, and SA360</w:t>
       </w:r>
     </w:p>
     <w:p>
@@ -3036,17 +3028,59 @@
           <w:sz w:val="18"/>
           <w:szCs w:val="18"/>
         </w:rPr>
-        <w:t>MotoSHOP SMS (Advance Auto Parts, 2014-2018)</w:t>
-      </w:r>
-      <w:r>
-        <w:rPr>
-          <w:rStyle w:val="Strong1"/>
-          <w:rFonts w:ascii="Century Gothic" w:eastAsia="Century Gothic" w:hAnsi="Century Gothic" w:cs="Century Gothic"/>
-          <w:color w:val="231F20"/>
-          <w:sz w:val="18"/>
-          <w:szCs w:val="18"/>
-        </w:rPr>
-        <w:t>: Owned development of a mobile-first shop management system with VIN Scanner capabilities that cut cancellation rates from 75% to under 30% and drove 10-12% annual subscription growth for three consecutive years</w:t>
+        <w:t>V SHRED Mobile App (V SHRED, 2018):</w:t>
+      </w:r>
+      <w:r>
+        <w:rPr>
+          <w:rStyle w:val="Strong1"/>
+          <w:rFonts w:ascii="Century Gothic" w:eastAsia="Century Gothic" w:hAnsi="Century Gothic" w:cs="Century Gothic"/>
+          <w:color w:val="231F20"/>
+          <w:sz w:val="18"/>
+          <w:szCs w:val="18"/>
+        </w:rPr>
+        <w:t xml:space="preserve"> As Head of Product Management overseeing a 24-product digital portfolio, led end-to-end product development for a consumer fitness app that hit 100K downloads in its first 24 hours, with sustained engagement and retention improvements post-launch.</w:t>
+      </w:r>
+    </w:p>
+    <w:p>
+      <w:pPr>
+        <w:pStyle w:val="divdocumentulli"/>
+        <w:numPr>
+          <w:ilvl w:val="0"/>
+          <w:numId w:val="10"/>
+        </w:numPr>
+        <w:pBdr>
+          <w:left w:val="none" w:sz="0" w:space="0" w:color="auto"/>
+        </w:pBdr>
+        <w:spacing w:line="280" w:lineRule="atLeast"/>
+        <w:ind w:left="380" w:hanging="283"/>
+        <w:rPr>
+          <w:rFonts w:ascii="Century Gothic" w:eastAsia="Century Gothic" w:hAnsi="Century Gothic" w:cs="Century Gothic"/>
+          <w:color w:val="231F20"/>
+          <w:sz w:val="18"/>
+          <w:szCs w:val="18"/>
+        </w:rPr>
+      </w:pPr>
+      <w:r>
+        <w:rPr>
+          <w:rStyle w:val="Strong1"/>
+          <w:rFonts w:ascii="Century Gothic" w:eastAsia="Century Gothic" w:hAnsi="Century Gothic" w:cs="Century Gothic"/>
+          <w:b/>
+          <w:bCs/>
+          <w:color w:val="231F20"/>
+          <w:sz w:val="18"/>
+          <w:szCs w:val="18"/>
+        </w:rPr>
+        <w:t>MotoSHOP SMS (Advance Auto Parts, 2014-2018):</w:t>
+      </w:r>
+      <w:r>
+        <w:rPr>
+          <w:rStyle w:val="Strong1"/>
+          <w:rFonts w:ascii="Century Gothic" w:eastAsia="Century Gothic" w:hAnsi="Century Gothic" w:cs="Century Gothic"/>
+          <w:color w:val="231F20"/>
+          <w:sz w:val="18"/>
+          <w:szCs w:val="18"/>
+        </w:rPr>
+        <w:t xml:space="preserve"> Owned development of a mobile-first shop management system with VIN Scanner capabilities that cut cancellation rates from 75% to under 30% and drove 10-12% annual subscription growth for three consecutive years</w:t>
       </w:r>
     </w:p>
     <w:tbl>
@@ -3161,7 +3195,7 @@
           <w:sz w:val="18"/>
           <w:szCs w:val="18"/>
         </w:rPr>
-        <w:t xml:space="preserve"> Snowflake, Databricks, SQL, SQL Server, Looker, Tableau, Google Analytics, ETL, Airflow</w:t>
+        <w:t xml:space="preserve"> Decision Systems and Key Performance Indicator Frameworks, Lineage and Reconciliation, Event Instrumentation, Snowflake, BigQuery, Audit-Ready Reporting</w:t>
       </w:r>
     </w:p>
     <w:p>
@@ -3204,7 +3238,7 @@
           <w:sz w:val="18"/>
           <w:szCs w:val="18"/>
         </w:rPr>
-        <w:t xml:space="preserve"> AI Product Strategy, ML Integration, Generative AI Products, AI Portfolio Governance, Privacy-Safe Data Architecture</w:t>
+        <w:t xml:space="preserve"> Agentic Systems, Machine Learning and Artificial Intelligence Platform Product, Generative Artificial Intelligence Products, Evaluation and Trust Thresholds, Artificial Intelligence Portfolio Governance, Privacy-Safe Data Architecture</w:t>
       </w:r>
     </w:p>
     <w:p>
@@ -5816,6 +5850,8 @@
     <w:rPrDefault>
       <w:rPr>
         <w:rFonts w:ascii="Century Gothic" w:eastAsia="Century Gothic" w:hAnsi="Century Gothic" w:cs="Century Gothic"/>
+        <w:sz w:val="18"/>
+        <w:szCs w:val="18"/>
         <w:lang w:val="en-US" w:eastAsia="en-US" w:bidi="ar-SA"/>
       </w:rPr>
     </w:rPrDefault>
@@ -6341,6 +6377,8 @@
     <w:semiHidden/>
     <w:unhideWhenUsed/>
     <w:rPr>
+      <w:sz w:val="18"/>
+      <w:szCs w:val="18"/>
       <w:rFonts w:ascii="Century Gothic" w:eastAsia="Century Gothic" w:hAnsi="Century Gothic" w:cs="Century Gothic"/>
     </w:rPr>
   </w:style>
@@ -6685,6 +6723,8 @@
     <w:unhideWhenUsed/>
     <w:rsid w:val="00D55029"/>
     <w:rPr>
+      <w:sz w:val="18"/>
+      <w:szCs w:val="18"/>
       <w:rFonts w:ascii="Century Gothic" w:eastAsia="Century Gothic" w:hAnsi="Century Gothic" w:cs="Century Gothic"/>
       <w:color w:val="0000FF"/>
       <w:u w:val="single"/>
@@ -6709,6 +6749,8 @@
     <w:unhideWhenUsed/>
     <w:rsid w:val="000309FA"/>
     <w:rPr>
+      <w:sz w:val="18"/>
+      <w:szCs w:val="18"/>
       <w:rFonts w:ascii="Century Gothic" w:eastAsia="Century Gothic" w:hAnsi="Century Gothic" w:cs="Century Gothic"/>
       <w:color w:val="800080"/>
       <w:u w:val="single"/>

</xml_diff>

<commit_message>
Sync portfolio: AI/ML platforms resume Word PDF + orchestration keywords
</commit_message>
<xml_diff>
--- a/docs/resume/clinton-pracher-platform-data-ai-resume.docx
+++ b/docs/resume/clinton-pracher-platform-data-ai-resume.docx
@@ -312,7 +312,7 @@
                 <w:rFonts w:ascii="Century Gothic" w:eastAsia="Century Gothic" w:hAnsi="Century Gothic" w:cs="Century Gothic"/>
                 <w:color w:val="FFFFFF"/>
               </w:rPr>
-              <w:t>DIRECTOR · ARTIFICIAL INTELLIGENCE PLATFORM · AGENTIC SYSTEMS · ENTERPRISE READINESS</w:t>
+              <w:t>DIRECTOR · AI/ML PLATFORMS · AGENTIC SYSTEMS · ENTERPRISE READINESS</w:t>
             </w:r>
           </w:p>
           <w:p>
@@ -563,7 +563,7 @@
           <w:sz w:val="18"/>
           <w:szCs w:val="18"/>
         </w:rPr>
-        <w:t>Director-level platform and artificial intelligence product leader with 12+ years owning complex portfolios across artificial intelligence platforms, data products, and enterprise environments. Owned 13 artificial intelligence and data products across 100+ global markets, leading 60+ engineers, analysts, and program leads with an $8M investment envelope tied to systems governing $600M in annual spend.</w:t>
+        <w:t>Director-level platform and AI product leader with 12+ years owning complex portfolios across AI platforms, data products, and enterprise environments. Owned 13 AI and data products across 100+ global markets, leading 60+ engineers, analysts, and program leads with an $8M investment envelope tied to systems governing $600M in annual spend.</w:t>
       </w:r>
     </w:p>
     <w:p>
@@ -581,7 +581,7 @@
           <w:sz w:val="18"/>
           <w:szCs w:val="18"/>
         </w:rPr>
-        <w:t>Builds agentic operating systems and machine learning / artificial intelligence platform capabilities that enterprises can trust: ownership models, evaluation and trust thresholds, and human approval gates on production artificial intelligence workflows. In practice today: an Operator Control Plane with 65 skills and 28 governed automations running as a live control plane, not a slide deck.</w:t>
+        <w:t>Builds agentic orchestration and AI control-plane capabilities that enterprises can trust: routing work across agents and tools, ownership models, evaluation and trust thresholds, and human approval gates on production AI workflows. In practice today: an Operator Control Plane with 65 skills and 28 governed automations running as live agentic orchestration and control-plane infrastructure, not a slide deck.</w:t>
       </w:r>
     </w:p>
     <w:p>
@@ -599,7 +599,7 @@
           <w:sz w:val="18"/>
           <w:szCs w:val="18"/>
         </w:rPr>
-        <w:t>Ships enterprise readiness into the product lifecycle: compliance, privacy, artificial intelligence ethics, decision rights, and security-review partnership so platform adoption does not wait on one-off exceptions. Results include 40% faster investment decisions, $60M+ incremental revenue impact, and global platform scale.</w:t>
+        <w:t>Ships enterprise readiness into the product lifecycle: compliance, privacy, AI ethics, decision rights, and security-review partnership so platform adoption does not wait on one-off exceptions. Results include 40% faster investment decisions, $60M+ incremental revenue impact, and global platform scale.</w:t>
       </w:r>
     </w:p>
     <w:p>
@@ -617,7 +617,7 @@
           <w:sz w:val="18"/>
           <w:szCs w:val="18"/>
         </w:rPr>
-        <w:t>Most effective when artificial intelligence adoption, platform complexity, or unclear ownership has outgrown the operating model. Diagnoses the constraint, rebuilds the control plane, and leaves teams with infrastructure they can run without constant reinvention.</w:t>
+        <w:t>Most effective when AI adoption, platform complexity, or unclear ownership has outgrown the operating model. Diagnoses the constraint, rebuilds the orchestration and control plane, and leaves teams with infrastructure they can run without constant reinvention.</w:t>
       </w:r>
     </w:p>
     <w:tbl>
@@ -744,7 +744,7 @@
                 <w:sz w:val="18"/>
                 <w:szCs w:val="18"/>
               </w:rPr>
-              <w:t>Agentic Architecture and Artificial Intelligence Control Planes</w:t>
+              <w:t>Agentic Orchestration and AI Control Planes</w:t>
             </w:r>
           </w:p>
           <w:p>
@@ -772,7 +772,7 @@
                 <w:sz w:val="18"/>
                 <w:szCs w:val="18"/>
               </w:rPr>
-              <w:t>Machine Learning and Artificial Intelligence Platform Product</w:t>
+              <w:t>AI/ML Platform Product</w:t>
             </w:r>
           </w:p>
           <w:p>
@@ -890,7 +890,7 @@
                 <w:sz w:val="18"/>
                 <w:szCs w:val="18"/>
               </w:rPr>
-              <w:t>Cross-Functional Control Plane Design</w:t>
+              <w:t>Cross-Functional Agentic Orchestration Design</w:t>
             </w:r>
           </w:p>
           <w:p>
@@ -1119,7 +1119,7 @@
           <w:sz w:val="18"/>
           <w:szCs w:val="18"/>
         </w:rPr>
-        <w:t>Founded an independent product and artificial intelligence advisory practice focused on decision systems, operating models, agentic architecture, and enterprise-ready platform infrastructure for complex organizations</w:t>
+        <w:t>Founded an independent product and AI advisory practice focused on decision systems, operating models, agentic architecture, and enterprise-ready platform infrastructure for complex organizations</w:t>
       </w:r>
     </w:p>
     <w:p>
@@ -1175,7 +1175,7 @@
           <w:sz w:val="18"/>
           <w:szCs w:val="18"/>
         </w:rPr>
-        <w:t>Built and operate an agentic Operator Control Plane with 65 specialized skills and 28 governed automations, using Claude and Cursor with explicit task ownership, audit trails, and human approval gates on production artificial intelligence workflows</w:t>
+        <w:t>Built and operate an agentic orchestration and AI control plane (Operator Control Plane) with 65 specialized skills and 28 governed automations, using Claude and Cursor with explicit task ownership, audit trails, and human approval gates on production AI workflows</w:t>
       </w:r>
     </w:p>
     <w:p>
@@ -1323,7 +1323,7 @@
           <w:sz w:val="18"/>
           <w:szCs w:val="18"/>
         </w:rPr>
-        <w:t>Promoted from Senior Product Manager at Merkle to Director at Dentsu based on performance, taking ownership of 13 artificial intelligence and data products, an $8M budget, and a distributed team of 60+ engineers, analysts, and program leads across 100+ global markets</w:t>
+        <w:t>Promoted from Senior Product Manager at Merkle to Director at Dentsu based on performance, taking ownership of 13 AI and data products, an $8M budget, and a distributed team of 60+ engineers, analysts, and program leads across 100+ global markets</w:t>
       </w:r>
     </w:p>
     <w:p>
@@ -1351,7 +1351,7 @@
           <w:sz w:val="18"/>
           <w:szCs w:val="18"/>
         </w:rPr>
-        <w:t>Owned portfolio strategy for artificial intelligence and data platforms spanning customer data, identity, audience activation, content intelligence, production automation, and measurement, with enterprise readiness requirements embedded in delivery</w:t>
+        <w:t>Owned portfolio strategy for AI and data platforms spanning customer data, identity, audience activation, content intelligence, production automation, and measurement, with enterprise readiness requirements embedded in delivery</w:t>
       </w:r>
     </w:p>
     <w:p>
@@ -1435,7 +1435,7 @@
           <w:sz w:val="18"/>
           <w:szCs w:val="18"/>
         </w:rPr>
-        <w:t>Embedded General Data Protection Regulation, California Consumer Privacy Act, and artificial intelligence ethics requirements into the product development lifecycle so compliance became a scalable platform capability rather than a deal-by-deal exception process</w:t>
+        <w:t>Embedded GDPR, CCPA, and AI ethics requirements into the product development lifecycle so compliance became a scalable platform capability rather than a deal-by-deal exception process</w:t>
       </w:r>
     </w:p>
     <w:p>
@@ -2910,7 +2910,7 @@
           <w:sz w:val="18"/>
           <w:szCs w:val="18"/>
         </w:rPr>
-        <w:t xml:space="preserve"> Built and operate an agentic Operator Control Plane with 65 specialized skills and 28 governed automations, using Claude and Cursor with explicit task ownership, audit trails, and human approval gates on production artificial intelligence workflows.</w:t>
+        <w:t xml:space="preserve"> Built and operate an agentic orchestration and AI control plane with 65 specialized skills and 28 governed automations, using Claude and Cursor with explicit task ownership, audit trails, and human approval gates on production AI workflows.</w:t>
       </w:r>
     </w:p>
     <w:p>
@@ -3228,17 +3228,17 @@
           <w:sz w:val="18"/>
           <w:szCs w:val="18"/>
         </w:rPr>
-        <w:t>AI &amp; Machine Learning:</w:t>
-      </w:r>
-      <w:r>
-        <w:rPr>
-          <w:rStyle w:val="Strong1"/>
-          <w:rFonts w:ascii="Century Gothic" w:eastAsia="Century Gothic" w:hAnsi="Century Gothic" w:cs="Century Gothic"/>
-          <w:color w:val="231F20"/>
-          <w:sz w:val="18"/>
-          <w:szCs w:val="18"/>
-        </w:rPr>
-        <w:t xml:space="preserve"> Agentic Systems, Machine Learning and Artificial Intelligence Platform Product, Generative Artificial Intelligence Products, Evaluation and Trust Thresholds, Artificial Intelligence Portfolio Governance, Privacy-Safe Data Architecture</w:t>
+        <w:t>AI/ML:</w:t>
+      </w:r>
+      <w:r>
+        <w:rPr>
+          <w:rStyle w:val="Strong1"/>
+          <w:rFonts w:ascii="Century Gothic" w:eastAsia="Century Gothic" w:hAnsi="Century Gothic" w:cs="Century Gothic"/>
+          <w:color w:val="231F20"/>
+          <w:sz w:val="18"/>
+          <w:szCs w:val="18"/>
+        </w:rPr>
+        <w:t xml:space="preserve"> Agentic Orchestration, AI Control Planes, AI/ML Platform Product, Generative AI Products, Evaluation and Trust Thresholds, AI Portfolio Governance, Privacy-Safe Data Architecture</w:t>
       </w:r>
     </w:p>
     <w:p>
@@ -5850,6 +5850,14 @@
     <w:rPrDefault>
       <w:rPr>
         <w:rFonts w:ascii="Century Gothic" w:eastAsia="Century Gothic" w:hAnsi="Century Gothic" w:cs="Century Gothic"/>
+        <w:sz w:val="18"/>
+        <w:szCs w:val="18"/>
+        <w:sz w:val="18"/>
+        <w:szCs w:val="18"/>
+        <w:sz w:val="18"/>
+        <w:szCs w:val="18"/>
+        <w:sz w:val="18"/>
+        <w:szCs w:val="18"/>
         <w:sz w:val="18"/>
         <w:szCs w:val="18"/>
         <w:lang w:val="en-US" w:eastAsia="en-US" w:bidi="ar-SA"/>

</xml_diff>